<commit_message>
Added results of testing task 9.4
</commit_message>
<xml_diff>
--- a/lab09/TestSuite/TS-9_4.docx
+++ b/lab09/TestSuite/TS-9_4.docx
@@ -788,7 +788,19 @@
           <w:tcPr>
             <w:tcW w:w="1787" w:type="dxa"/>
           </w:tcPr>
-          <w:p/>
+          <w:p>
+            <w:pPr>
+              <w:rPr>
+                <w:lang w:val="en-US"/>
+              </w:rPr>
+            </w:pPr>
+            <w:r>
+              <w:rPr>
+                <w:lang w:val="en-US"/>
+              </w:rPr>
+              <w:t>passed</w:t>
+            </w:r>
+          </w:p>
         </w:tc>
       </w:tr>
       <w:tr>
@@ -833,7 +845,14 @@
           <w:tcPr>
             <w:tcW w:w="1787" w:type="dxa"/>
           </w:tcPr>
-          <w:p/>
+          <w:p>
+            <w:r>
+              <w:rPr>
+                <w:lang w:val="en-US"/>
+              </w:rPr>
+              <w:t>passed</w:t>
+            </w:r>
+          </w:p>
         </w:tc>
       </w:tr>
       <w:tr>
@@ -882,7 +901,14 @@
           <w:tcPr>
             <w:tcW w:w="1787" w:type="dxa"/>
           </w:tcPr>
-          <w:p/>
+          <w:p>
+            <w:r>
+              <w:rPr>
+                <w:lang w:val="en-US"/>
+              </w:rPr>
+              <w:t>passed</w:t>
+            </w:r>
+          </w:p>
         </w:tc>
       </w:tr>
       <w:tr>
@@ -927,7 +953,14 @@
           <w:tcPr>
             <w:tcW w:w="1787" w:type="dxa"/>
           </w:tcPr>
-          <w:p/>
+          <w:p>
+            <w:r>
+              <w:rPr>
+                <w:lang w:val="en-US"/>
+              </w:rPr>
+              <w:t>passed</w:t>
+            </w:r>
+          </w:p>
         </w:tc>
       </w:tr>
       <w:tr>
@@ -968,7 +1001,14 @@
           <w:tcPr>
             <w:tcW w:w="1787" w:type="dxa"/>
           </w:tcPr>
-          <w:p/>
+          <w:p>
+            <w:r>
+              <w:rPr>
+                <w:lang w:val="en-US"/>
+              </w:rPr>
+              <w:t>passed</w:t>
+            </w:r>
+          </w:p>
         </w:tc>
       </w:tr>
       <w:tr>
@@ -1009,7 +1049,14 @@
           <w:tcPr>
             <w:tcW w:w="1787" w:type="dxa"/>
           </w:tcPr>
-          <w:p/>
+          <w:p>
+            <w:r>
+              <w:rPr>
+                <w:lang w:val="en-US"/>
+              </w:rPr>
+              <w:t>passed</w:t>
+            </w:r>
+          </w:p>
         </w:tc>
       </w:tr>
     </w:tbl>
@@ -1166,7 +1213,7 @@
               <w:sz w:val="16"/>
               <w:szCs w:val="16"/>
             </w:rPr>
-            <w:t>14:16:11</w:t>
+            <w:t>14:19:28</w:t>
           </w:r>
           <w:r>
             <w:rPr>
@@ -1437,7 +1484,7 @@
               <w:sz w:val="16"/>
               <w:szCs w:val="16"/>
             </w:rPr>
-            <w:t>14:16:11</w:t>
+            <w:t>14:19:28</w:t>
           </w:r>
           <w:r>
             <w:rPr>

</xml_diff>